<commit_message>
Final edit to analysis
</commit_message>
<xml_diff>
--- a/3218861_Pelletier_Assignment_1/GenAI analysis.docx
+++ b/3218861_Pelletier_Assignment_1/GenAI analysis.docx
@@ -67,7 +67,13 @@
         <w:ind w:left="360"/>
       </w:pPr>
       <w:r>
-        <w:t xml:space="preserve">I accessed both of them through </w:t>
+        <w:t xml:space="preserve">I accessed </w:t>
+      </w:r>
+      <w:r>
+        <w:t>both</w:t>
+      </w:r>
+      <w:r>
+        <w:t xml:space="preserve"> through </w:t>
       </w:r>
       <w:r>
         <w:t xml:space="preserve">Google </w:t>
@@ -153,7 +159,15 @@
         <w:ind w:left="1440"/>
       </w:pPr>
       <w:r>
-        <w:t>The user gets up to 3 tries to guess the number.</w:t>
+        <w:t xml:space="preserve">The user gets up to </w:t>
+      </w:r>
+      <w:proofErr w:type="gramStart"/>
+      <w:r>
+        <w:t>3 tries</w:t>
+      </w:r>
+      <w:proofErr w:type="gramEnd"/>
+      <w:r>
+        <w:t xml:space="preserve"> to guess the number.</w:t>
       </w:r>
     </w:p>
     <w:p>
@@ -196,8 +210,13 @@
       </w:r>
       <w:proofErr w:type="spellEnd"/>
       <w:r>
-        <w:t xml:space="preserve"> to read their</w:t>
-      </w:r>
+        <w:t xml:space="preserve"> to read </w:t>
+      </w:r>
+      <w:proofErr w:type="gramStart"/>
+      <w:r>
+        <w:t>their</w:t>
+      </w:r>
+      <w:proofErr w:type="gramEnd"/>
     </w:p>
     <w:p>
       <w:pPr>
@@ -279,7 +298,15 @@
         <w:ind w:left="1440"/>
       </w:pPr>
       <w:r>
-        <w:t>Guess a number between 1 and 10.</w:t>
+        <w:t xml:space="preserve">Guess </w:t>
+      </w:r>
+      <w:proofErr w:type="gramStart"/>
+      <w:r>
+        <w:t>a number</w:t>
+      </w:r>
+      <w:proofErr w:type="gramEnd"/>
+      <w:r>
+        <w:t xml:space="preserve"> between 1 and 10.</w:t>
       </w:r>
     </w:p>
     <w:p>
@@ -383,8 +410,13 @@
         <w:spacing w:line="240" w:lineRule="auto"/>
         <w:ind w:left="1440"/>
       </w:pPr>
-      <w:r>
-        <w:t>#include &lt;</w:t>
+      <w:proofErr w:type="gramStart"/>
+      <w:r>
+        <w:t>#include</w:t>
+      </w:r>
+      <w:proofErr w:type="gramEnd"/>
+      <w:r>
+        <w:t xml:space="preserve"> &lt;</w:t>
       </w:r>
       <w:proofErr w:type="spellStart"/>
       <w:r>
@@ -452,12 +484,17 @@
         <w:t xml:space="preserve">    </w:t>
       </w:r>
       <w:proofErr w:type="spellStart"/>
+      <w:proofErr w:type="gramStart"/>
       <w:r>
         <w:t>printf</w:t>
       </w:r>
       <w:proofErr w:type="spellEnd"/>
       <w:r>
-        <w:t>("Guess a number between 1 and 10.\n");</w:t>
+        <w:t>(</w:t>
+      </w:r>
+      <w:proofErr w:type="gramEnd"/>
+      <w:r>
+        <w:t>"Guess a number between 1 and 10.\n");</w:t>
       </w:r>
     </w:p>
     <w:p>
@@ -496,8 +533,13 @@
       </w:r>
       <w:proofErr w:type="spellEnd"/>
       <w:r>
-        <w:t>++) {</w:t>
-      </w:r>
+        <w:t>+</w:t>
+      </w:r>
+      <w:proofErr w:type="gramStart"/>
+      <w:r>
+        <w:t>+) {</w:t>
+      </w:r>
+      <w:proofErr w:type="gramEnd"/>
     </w:p>
     <w:p>
       <w:pPr>
@@ -508,12 +550,17 @@
         <w:t xml:space="preserve">        </w:t>
       </w:r>
       <w:proofErr w:type="spellStart"/>
+      <w:proofErr w:type="gramStart"/>
       <w:r>
         <w:t>printf</w:t>
       </w:r>
       <w:proofErr w:type="spellEnd"/>
       <w:r>
-        <w:t xml:space="preserve">("Attempt %d/%d. Enter your guess: ", </w:t>
+        <w:t>(</w:t>
+      </w:r>
+      <w:proofErr w:type="gramEnd"/>
+      <w:r>
+        <w:t xml:space="preserve">"Attempt %d/%d. Enter your guess: ", </w:t>
       </w:r>
       <w:proofErr w:type="spellStart"/>
       <w:r>
@@ -533,6 +580,7 @@
         <w:t xml:space="preserve">        </w:t>
       </w:r>
       <w:proofErr w:type="spellStart"/>
+      <w:proofErr w:type="gramStart"/>
       <w:r>
         <w:t>s</w:t>
       </w:r>
@@ -541,23 +589,32 @@
       </w:r>
       <w:proofErr w:type="spellEnd"/>
       <w:r>
-        <w:t>("%d", &amp;guess);</w:t>
-      </w:r>
-    </w:p>
-    <w:p>
-      <w:pPr>
-        <w:spacing w:line="240" w:lineRule="auto"/>
-        <w:ind w:left="1440"/>
-      </w:pPr>
-    </w:p>
-    <w:p>
-      <w:pPr>
-        <w:spacing w:line="240" w:lineRule="auto"/>
-        <w:ind w:left="1440"/>
-      </w:pPr>
-      <w:r>
-        <w:t>        if (guess == secret) {</w:t>
-      </w:r>
+        <w:t>(</w:t>
+      </w:r>
+      <w:proofErr w:type="gramEnd"/>
+      <w:r>
+        <w:t>"%d", &amp;guess);</w:t>
+      </w:r>
+    </w:p>
+    <w:p>
+      <w:pPr>
+        <w:spacing w:line="240" w:lineRule="auto"/>
+        <w:ind w:left="1440"/>
+      </w:pPr>
+    </w:p>
+    <w:p>
+      <w:pPr>
+        <w:spacing w:line="240" w:lineRule="auto"/>
+        <w:ind w:left="1440"/>
+      </w:pPr>
+      <w:r>
+        <w:t xml:space="preserve">        if (guess == </w:t>
+      </w:r>
+      <w:proofErr w:type="gramStart"/>
+      <w:r>
+        <w:t>secret) {</w:t>
+      </w:r>
+      <w:proofErr w:type="gramEnd"/>
     </w:p>
     <w:p>
       <w:pPr>
@@ -568,12 +625,25 @@
         <w:t xml:space="preserve">            </w:t>
       </w:r>
       <w:proofErr w:type="spellStart"/>
+      <w:proofErr w:type="gramStart"/>
       <w:r>
         <w:t>printf</w:t>
       </w:r>
       <w:proofErr w:type="spellEnd"/>
       <w:r>
-        <w:t>("Correct! You win!\n");</w:t>
+        <w:t>(</w:t>
+      </w:r>
+      <w:proofErr w:type="gramEnd"/>
+      <w:r>
+        <w:t xml:space="preserve">"Correct! You </w:t>
+      </w:r>
+      <w:proofErr w:type="gramStart"/>
+      <w:r>
+        <w:t>win!\</w:t>
+      </w:r>
+      <w:proofErr w:type="gramEnd"/>
+      <w:r>
+        <w:t>n");</w:t>
       </w:r>
     </w:p>
     <w:p>
@@ -591,8 +661,13 @@
         <w:ind w:left="1440"/>
       </w:pPr>
       <w:r>
-        <w:t>        } else if (guess &lt; secret) {</w:t>
-      </w:r>
+        <w:t xml:space="preserve">        } else if (guess &lt; </w:t>
+      </w:r>
+      <w:proofErr w:type="gramStart"/>
+      <w:r>
+        <w:t>secret) {</w:t>
+      </w:r>
+      <w:proofErr w:type="gramEnd"/>
     </w:p>
     <w:p>
       <w:pPr>
@@ -603,12 +678,17 @@
         <w:t xml:space="preserve">            </w:t>
       </w:r>
       <w:proofErr w:type="spellStart"/>
+      <w:proofErr w:type="gramStart"/>
       <w:r>
         <w:t>printf</w:t>
       </w:r>
       <w:proofErr w:type="spellEnd"/>
       <w:r>
-        <w:t>("Too low! Try again.\n");</w:t>
+        <w:t>(</w:t>
+      </w:r>
+      <w:proofErr w:type="gramEnd"/>
+      <w:r>
+        <w:t>"Too low! Try again.\n");</w:t>
       </w:r>
     </w:p>
     <w:p>
@@ -629,12 +709,17 @@
         <w:t xml:space="preserve">            </w:t>
       </w:r>
       <w:proofErr w:type="spellStart"/>
+      <w:proofErr w:type="gramStart"/>
       <w:r>
         <w:t>printf</w:t>
       </w:r>
       <w:proofErr w:type="spellEnd"/>
       <w:r>
-        <w:t>("Too high! Try again.\n");</w:t>
+        <w:t>(</w:t>
+      </w:r>
+      <w:proofErr w:type="gramEnd"/>
+      <w:r>
+        <w:t>"Too high! Try again.\n");</w:t>
       </w:r>
     </w:p>
     <w:p>
@@ -666,8 +751,21 @@
       </w:r>
       <w:proofErr w:type="spellEnd"/>
       <w:r>
-        <w:t xml:space="preserve"> == attempts &amp;&amp; guess != secret) {</w:t>
-      </w:r>
+        <w:t xml:space="preserve"> == attempts &amp;&amp; </w:t>
+      </w:r>
+      <w:proofErr w:type="gramStart"/>
+      <w:r>
+        <w:t>guess !</w:t>
+      </w:r>
+      <w:proofErr w:type="gramEnd"/>
+      <w:r>
+        <w:t xml:space="preserve">= </w:t>
+      </w:r>
+      <w:proofErr w:type="gramStart"/>
+      <w:r>
+        <w:t>secret) {</w:t>
+      </w:r>
+      <w:proofErr w:type="gramEnd"/>
     </w:p>
     <w:p>
       <w:pPr>
@@ -678,12 +776,17 @@
         <w:t xml:space="preserve">            </w:t>
       </w:r>
       <w:proofErr w:type="spellStart"/>
+      <w:proofErr w:type="gramStart"/>
       <w:r>
         <w:t>printf</w:t>
       </w:r>
       <w:proofErr w:type="spellEnd"/>
       <w:r>
-        <w:t>("You lose! The number was %d.\n", secret);</w:t>
+        <w:t>(</w:t>
+      </w:r>
+      <w:proofErr w:type="gramEnd"/>
+      <w:r>
+        <w:t>"You lose! The number was %d.\n", secret);</w:t>
       </w:r>
     </w:p>
     <w:p>
@@ -754,8 +857,13 @@
         <w:spacing w:line="240" w:lineRule="auto"/>
         <w:ind w:left="1440"/>
       </w:pPr>
-      <w:r>
-        <w:t>#include &lt;</w:t>
+      <w:proofErr w:type="gramStart"/>
+      <w:r>
+        <w:t>#include</w:t>
+      </w:r>
+      <w:proofErr w:type="gramEnd"/>
+      <w:r>
+        <w:t xml:space="preserve"> &lt;</w:t>
       </w:r>
       <w:proofErr w:type="spellStart"/>
       <w:r>
@@ -778,16 +886,32 @@
         <w:ind w:left="1440"/>
       </w:pPr>
       <w:r>
-        <w:t>int main() {</w:t>
-      </w:r>
-    </w:p>
-    <w:p>
-      <w:pPr>
-        <w:spacing w:line="240" w:lineRule="auto"/>
-        <w:ind w:left="1440"/>
-      </w:pPr>
-      <w:r>
-        <w:t>    int secret = 7;          // fixed secret number</w:t>
+        <w:t xml:space="preserve">int </w:t>
+      </w:r>
+      <w:proofErr w:type="gramStart"/>
+      <w:r>
+        <w:t>main(</w:t>
+      </w:r>
+      <w:proofErr w:type="gramEnd"/>
+      <w:r>
+        <w:t>) {</w:t>
+      </w:r>
+    </w:p>
+    <w:p>
+      <w:pPr>
+        <w:spacing w:line="240" w:lineRule="auto"/>
+        <w:ind w:left="1440"/>
+      </w:pPr>
+      <w:r>
+        <w:t xml:space="preserve">    int secret = </w:t>
+      </w:r>
+      <w:proofErr w:type="gramStart"/>
+      <w:r>
+        <w:t xml:space="preserve">7;   </w:t>
+      </w:r>
+      <w:proofErr w:type="gramEnd"/>
+      <w:r>
+        <w:t>       // fixed secret number</w:t>
       </w:r>
     </w:p>
     <w:p>
@@ -823,12 +947,17 @@
         <w:t xml:space="preserve">    </w:t>
       </w:r>
       <w:proofErr w:type="spellStart"/>
+      <w:proofErr w:type="gramStart"/>
       <w:r>
         <w:t>printf</w:t>
       </w:r>
       <w:proofErr w:type="spellEnd"/>
       <w:r>
-        <w:t>("Guess a number between 1 and 10.\n");</w:t>
+        <w:t>(</w:t>
+      </w:r>
+      <w:proofErr w:type="gramEnd"/>
+      <w:r>
+        <w:t>"Guess a number between 1 and 10.\n");</w:t>
       </w:r>
     </w:p>
     <w:p>
@@ -867,8 +996,13 @@
       </w:r>
       <w:proofErr w:type="spellEnd"/>
       <w:r>
-        <w:t>++) {</w:t>
-      </w:r>
+        <w:t>+</w:t>
+      </w:r>
+      <w:proofErr w:type="gramStart"/>
+      <w:r>
+        <w:t>+) {</w:t>
+      </w:r>
+      <w:proofErr w:type="gramEnd"/>
     </w:p>
     <w:p>
       <w:pPr>
@@ -879,12 +1013,17 @@
         <w:t xml:space="preserve">        </w:t>
       </w:r>
       <w:proofErr w:type="spellStart"/>
+      <w:proofErr w:type="gramStart"/>
       <w:r>
         <w:t>printf</w:t>
       </w:r>
       <w:proofErr w:type="spellEnd"/>
       <w:r>
-        <w:t xml:space="preserve">("Attempt %d/%3d. Enter your guess: ", </w:t>
+        <w:t>(</w:t>
+      </w:r>
+      <w:proofErr w:type="gramEnd"/>
+      <w:r>
+        <w:t xml:space="preserve">"Attempt %d/%3d. Enter your guess: ", </w:t>
       </w:r>
       <w:proofErr w:type="spellStart"/>
       <w:r>
@@ -904,28 +1043,38 @@
         <w:t xml:space="preserve">        </w:t>
       </w:r>
       <w:proofErr w:type="spellStart"/>
+      <w:proofErr w:type="gramStart"/>
       <w:r>
         <w:t>scanf</w:t>
       </w:r>
       <w:proofErr w:type="spellEnd"/>
       <w:r>
-        <w:t>("%d", &amp;guess);</w:t>
-      </w:r>
-    </w:p>
-    <w:p>
-      <w:pPr>
-        <w:spacing w:line="240" w:lineRule="auto"/>
-        <w:ind w:left="1440"/>
-      </w:pPr>
-    </w:p>
-    <w:p>
-      <w:pPr>
-        <w:spacing w:line="240" w:lineRule="auto"/>
-        <w:ind w:left="1440"/>
-      </w:pPr>
-      <w:r>
-        <w:t>        if (guess == secret) {</w:t>
-      </w:r>
+        <w:t>(</w:t>
+      </w:r>
+      <w:proofErr w:type="gramEnd"/>
+      <w:r>
+        <w:t>"%d", &amp;guess);</w:t>
+      </w:r>
+    </w:p>
+    <w:p>
+      <w:pPr>
+        <w:spacing w:line="240" w:lineRule="auto"/>
+        <w:ind w:left="1440"/>
+      </w:pPr>
+    </w:p>
+    <w:p>
+      <w:pPr>
+        <w:spacing w:line="240" w:lineRule="auto"/>
+        <w:ind w:left="1440"/>
+      </w:pPr>
+      <w:r>
+        <w:t xml:space="preserve">        if (guess == </w:t>
+      </w:r>
+      <w:proofErr w:type="gramStart"/>
+      <w:r>
+        <w:t>secret) {</w:t>
+      </w:r>
+      <w:proofErr w:type="gramEnd"/>
     </w:p>
     <w:p>
       <w:pPr>
@@ -936,31 +1085,57 @@
         <w:t xml:space="preserve">            </w:t>
       </w:r>
       <w:proofErr w:type="spellStart"/>
+      <w:proofErr w:type="gramStart"/>
       <w:r>
         <w:t>printf</w:t>
       </w:r>
       <w:proofErr w:type="spellEnd"/>
       <w:r>
-        <w:t>("Correct! You win!\n");</w:t>
-      </w:r>
-    </w:p>
-    <w:p>
-      <w:pPr>
-        <w:spacing w:line="240" w:lineRule="auto"/>
-        <w:ind w:left="1440"/>
-      </w:pPr>
-      <w:r>
-        <w:t>            return 0;   // stop immediately</w:t>
-      </w:r>
-    </w:p>
-    <w:p>
-      <w:pPr>
-        <w:spacing w:line="240" w:lineRule="auto"/>
-        <w:ind w:left="1440"/>
-      </w:pPr>
-      <w:r>
-        <w:t>        } else if (guess &lt; secret) {</w:t>
-      </w:r>
+        <w:t>(</w:t>
+      </w:r>
+      <w:proofErr w:type="gramEnd"/>
+      <w:r>
+        <w:t xml:space="preserve">"Correct! You </w:t>
+      </w:r>
+      <w:proofErr w:type="gramStart"/>
+      <w:r>
+        <w:t>win!\</w:t>
+      </w:r>
+      <w:proofErr w:type="gramEnd"/>
+      <w:r>
+        <w:t>n");</w:t>
+      </w:r>
+    </w:p>
+    <w:p>
+      <w:pPr>
+        <w:spacing w:line="240" w:lineRule="auto"/>
+        <w:ind w:left="1440"/>
+      </w:pPr>
+      <w:r>
+        <w:t xml:space="preserve">            return </w:t>
+      </w:r>
+      <w:proofErr w:type="gramStart"/>
+      <w:r>
+        <w:t xml:space="preserve">0;   </w:t>
+      </w:r>
+      <w:proofErr w:type="gramEnd"/>
+      <w:r>
+        <w:t>// stop immediately</w:t>
+      </w:r>
+    </w:p>
+    <w:p>
+      <w:pPr>
+        <w:spacing w:line="240" w:lineRule="auto"/>
+        <w:ind w:left="1440"/>
+      </w:pPr>
+      <w:r>
+        <w:t xml:space="preserve">        } else if (guess &lt; </w:t>
+      </w:r>
+      <w:proofErr w:type="gramStart"/>
+      <w:r>
+        <w:t>secret) {</w:t>
+      </w:r>
+      <w:proofErr w:type="gramEnd"/>
     </w:p>
     <w:p>
       <w:pPr>
@@ -972,12 +1147,17 @@
         <w:t xml:space="preserve">            </w:t>
       </w:r>
       <w:proofErr w:type="spellStart"/>
+      <w:proofErr w:type="gramStart"/>
       <w:r>
         <w:t>printf</w:t>
       </w:r>
       <w:proofErr w:type="spellEnd"/>
       <w:r>
-        <w:t>("Too low! Try again.\n");</w:t>
+        <w:t>(</w:t>
+      </w:r>
+      <w:proofErr w:type="gramEnd"/>
+      <w:r>
+        <w:t>"Too low! Try again.\n");</w:t>
       </w:r>
     </w:p>
     <w:p>
@@ -998,12 +1178,17 @@
         <w:t xml:space="preserve">            </w:t>
       </w:r>
       <w:proofErr w:type="spellStart"/>
+      <w:proofErr w:type="gramStart"/>
       <w:r>
         <w:t>printf</w:t>
       </w:r>
       <w:proofErr w:type="spellEnd"/>
       <w:r>
-        <w:t>("Too high! Try again.\n");</w:t>
+        <w:t>(</w:t>
+      </w:r>
+      <w:proofErr w:type="gramEnd"/>
+      <w:r>
+        <w:t>"Too high! Try again.\n");</w:t>
       </w:r>
     </w:p>
     <w:p>
@@ -1039,12 +1224,17 @@
         <w:t xml:space="preserve">    </w:t>
       </w:r>
       <w:proofErr w:type="spellStart"/>
+      <w:proofErr w:type="gramStart"/>
       <w:r>
         <w:t>printf</w:t>
       </w:r>
       <w:proofErr w:type="spellEnd"/>
       <w:r>
-        <w:t>("Sorry, you lose. The number was %d.\n", secret);</w:t>
+        <w:t>(</w:t>
+      </w:r>
+      <w:proofErr w:type="gramEnd"/>
+      <w:r>
+        <w:t>"Sorry, you lose. The number was %d.\n", secret);</w:t>
       </w:r>
     </w:p>
     <w:p>
@@ -1247,7 +1437,23 @@
           <w:b/>
           <w:bCs/>
         </w:rPr>
-        <w:t>Both codes have the exact same space complexity of \(O(1)\) (constant space)</w:t>
+        <w:t>Both codes have the exact same space complexity of \(</w:t>
+      </w:r>
+      <w:proofErr w:type="gramStart"/>
+      <w:r>
+        <w:rPr>
+          <w:b/>
+          <w:bCs/>
+        </w:rPr>
+        <w:t>O(1)\</w:t>
+      </w:r>
+      <w:proofErr w:type="gramEnd"/>
+      <w:r>
+        <w:rPr>
+          <w:b/>
+          <w:bCs/>
+        </w:rPr>
+        <w:t>) (constant space)</w:t>
       </w:r>
       <w:r>
         <w:t>, and they cannot be improved further from a memory standpoint because they already use the absolute minimum amount of memory required for this program.</w:t>
@@ -1366,8 +1572,26 @@
       <w:r>
         <w:t xml:space="preserve"> as the basis for my code because </w:t>
       </w:r>
-    </w:p>
-    <w:p/>
+      <w:r>
+        <w:t xml:space="preserve">of </w:t>
+      </w:r>
+      <w:proofErr w:type="spellStart"/>
+      <w:proofErr w:type="gramStart"/>
+      <w:r>
+        <w:t>it’s</w:t>
+      </w:r>
+      <w:proofErr w:type="spellEnd"/>
+      <w:proofErr w:type="gramEnd"/>
+      <w:r>
+        <w:t xml:space="preserve"> superior </w:t>
+      </w:r>
+      <w:r>
+        <w:t xml:space="preserve">execution time and maintainability. I believe it would be easier to make the changes I want to make onto that code, like </w:t>
+      </w:r>
+      <w:r>
+        <w:t xml:space="preserve">only having the try again message on the first two attempts. </w:t>
+      </w:r>
+    </w:p>
     <w:p/>
     <w:p>
       <w:pPr>
@@ -1395,6 +1619,253 @@
         <w:t>space complexity, and maintainability.</w:t>
       </w:r>
     </w:p>
+    <w:p>
+      <w:pPr>
+        <w:pStyle w:val="ListParagraph"/>
+        <w:numPr>
+          <w:ilvl w:val="0"/>
+          <w:numId w:val="4"/>
+        </w:numPr>
+      </w:pPr>
+      <w:r>
+        <w:tab/>
+      </w:r>
+      <w:r>
+        <w:t>Correctness</w:t>
+      </w:r>
+    </w:p>
+    <w:p>
+      <w:pPr>
+        <w:ind w:left="720" w:firstLine="360"/>
+      </w:pPr>
+      <w:r>
+        <w:t>I changed the code to a</w:t>
+      </w:r>
+      <w:r>
+        <w:t xml:space="preserve">llow </w:t>
+      </w:r>
+      <w:r>
+        <w:t xml:space="preserve">it </w:t>
+      </w:r>
+      <w:r>
+        <w:t>to handle a</w:t>
+      </w:r>
+      <w:r>
+        <w:t xml:space="preserve"> string input </w:t>
+      </w:r>
+      <w:r>
+        <w:t xml:space="preserve">and make the user </w:t>
+      </w:r>
+      <w:r>
+        <w:t xml:space="preserve">keep </w:t>
+      </w:r>
+      <w:r>
+        <w:t>input</w:t>
+      </w:r>
+      <w:r>
+        <w:t xml:space="preserve"> until they input a number. </w:t>
+      </w:r>
+      <w:r>
+        <w:t>It also now t</w:t>
+      </w:r>
+      <w:r>
+        <w:t xml:space="preserve">ells </w:t>
+      </w:r>
+      <w:r>
+        <w:t xml:space="preserve">the </w:t>
+      </w:r>
+      <w:r>
+        <w:t>user they cannot guess a number below</w:t>
+      </w:r>
+      <w:r>
+        <w:t xml:space="preserve"> 1 and above 10</w:t>
+      </w:r>
+      <w:r>
+        <w:t xml:space="preserve"> </w:t>
+      </w:r>
+      <w:r>
+        <w:t xml:space="preserve">if it is attempted </w:t>
+      </w:r>
+      <w:r>
+        <w:t>and repeat</w:t>
+      </w:r>
+      <w:r>
+        <w:t>s</w:t>
+      </w:r>
+      <w:r>
+        <w:t xml:space="preserve"> the code</w:t>
+      </w:r>
+      <w:r>
+        <w:t xml:space="preserve"> until valid input</w:t>
+      </w:r>
+      <w:r>
+        <w:t xml:space="preserve"> without using up the attempt.</w:t>
+      </w:r>
+      <w:r>
+        <w:t xml:space="preserve"> </w:t>
+      </w:r>
+      <w:r>
+        <w:t>Finally,</w:t>
+      </w:r>
+      <w:r>
+        <w:t xml:space="preserve"> </w:t>
+      </w:r>
+      <w:proofErr w:type="gramStart"/>
+      <w:r>
+        <w:t xml:space="preserve">the </w:t>
+      </w:r>
+      <w:r>
+        <w:t>try</w:t>
+      </w:r>
+      <w:proofErr w:type="gramEnd"/>
+      <w:r>
+        <w:t xml:space="preserve"> again</w:t>
+      </w:r>
+      <w:r>
+        <w:t xml:space="preserve"> message will not prin</w:t>
+      </w:r>
+      <w:r>
+        <w:t>t</w:t>
+      </w:r>
+      <w:r>
+        <w:t xml:space="preserve"> if the user doesn’t guess the number on the last attempt</w:t>
+      </w:r>
+      <w:r>
+        <w:t>.</w:t>
+      </w:r>
+    </w:p>
+    <w:p>
+      <w:r>
+        <w:tab/>
+      </w:r>
+    </w:p>
+    <w:p>
+      <w:pPr>
+        <w:pStyle w:val="ListParagraph"/>
+        <w:numPr>
+          <w:ilvl w:val="0"/>
+          <w:numId w:val="4"/>
+        </w:numPr>
+      </w:pPr>
+      <w:r>
+        <w:lastRenderedPageBreak/>
+        <w:t>Execution time</w:t>
+      </w:r>
+    </w:p>
+    <w:p>
+      <w:pPr>
+        <w:ind w:left="720" w:firstLine="360"/>
+      </w:pPr>
+      <w:proofErr w:type="gramStart"/>
+      <w:r>
+        <w:t>In order to</w:t>
+      </w:r>
+      <w:proofErr w:type="gramEnd"/>
+      <w:r>
+        <w:t xml:space="preserve"> fix the correctness of the string handling </w:t>
+      </w:r>
+      <w:r>
+        <w:t xml:space="preserve">and valid inputs and outputs, the execution time </w:t>
+      </w:r>
+      <w:r>
+        <w:t>increased slightly, but it is still better than Claude because it does not have the redundant if statement at the end of the program.</w:t>
+      </w:r>
+    </w:p>
+    <w:p>
+      <w:pPr>
+        <w:ind w:left="1080"/>
+      </w:pPr>
+    </w:p>
+    <w:p>
+      <w:pPr>
+        <w:pStyle w:val="ListParagraph"/>
+        <w:numPr>
+          <w:ilvl w:val="0"/>
+          <w:numId w:val="4"/>
+        </w:numPr>
+      </w:pPr>
+      <w:r>
+        <w:t>Space Complexity</w:t>
+      </w:r>
+    </w:p>
+    <w:p>
+      <w:pPr>
+        <w:ind w:left="720" w:firstLine="360"/>
+      </w:pPr>
+      <w:r>
+        <w:t>Space complexity also</w:t>
+      </w:r>
+      <w:r>
+        <w:t xml:space="preserve"> unfortunately increased slightly with the correctness </w:t>
+      </w:r>
+      <w:proofErr w:type="gramStart"/>
+      <w:r>
+        <w:t>fixing,</w:t>
+      </w:r>
+      <w:proofErr w:type="gramEnd"/>
+      <w:r>
+        <w:t xml:space="preserve"> however it is still as optimal as it can be with the level of </w:t>
+      </w:r>
+      <w:r>
+        <w:t>maintainability that it is at.</w:t>
+      </w:r>
+    </w:p>
+    <w:p/>
+    <w:p>
+      <w:pPr>
+        <w:pStyle w:val="ListParagraph"/>
+        <w:numPr>
+          <w:ilvl w:val="0"/>
+          <w:numId w:val="4"/>
+        </w:numPr>
+      </w:pPr>
+      <w:r>
+        <w:t xml:space="preserve">Maintainability </w:t>
+      </w:r>
+    </w:p>
+    <w:p>
+      <w:pPr>
+        <w:ind w:left="720" w:firstLine="360"/>
+      </w:pPr>
+      <w:r>
+        <w:t xml:space="preserve">Added comments to every line as well as a </w:t>
+      </w:r>
+      <w:r>
+        <w:t>prologue</w:t>
+      </w:r>
+      <w:r>
+        <w:t xml:space="preserve"> comment and comments </w:t>
+      </w:r>
+      <w:r>
+        <w:t>explaining large blocks of code</w:t>
+      </w:r>
+      <w:r>
+        <w:t>. Also changed the “</w:t>
+      </w:r>
+      <w:proofErr w:type="spellStart"/>
+      <w:r>
+        <w:t>i</w:t>
+      </w:r>
+      <w:proofErr w:type="spellEnd"/>
+      <w:r>
+        <w:t xml:space="preserve">” variable </w:t>
+      </w:r>
+      <w:r>
+        <w:t xml:space="preserve">to attempt and attempts to </w:t>
+      </w:r>
+      <w:proofErr w:type="spellStart"/>
+      <w:r>
+        <w:t>max_attempts</w:t>
+      </w:r>
+      <w:proofErr w:type="spellEnd"/>
+      <w:r>
+        <w:t xml:space="preserve"> to </w:t>
+      </w:r>
+      <w:r>
+        <w:t>improve readability and therefore maintainability.</w:t>
+      </w:r>
+    </w:p>
+    <w:p/>
     <w:p/>
     <w:p/>
     <w:sectPr>
@@ -1676,6 +2147,95 @@
       </w:pPr>
     </w:lvl>
   </w:abstractNum>
+  <w:abstractNum w:abstractNumId="3" w15:restartNumberingAfterBreak="0">
+    <w:nsid w:val="71692530"/>
+    <w:multiLevelType w:val="hybridMultilevel"/>
+    <w:tmpl w:val="170ED86C"/>
+    <w:lvl w:ilvl="0" w:tplc="FFFFFFFF">
+      <w:start w:val="1"/>
+      <w:numFmt w:val="lowerLetter"/>
+      <w:lvlText w:val="%1)"/>
+      <w:lvlJc w:val="left"/>
+      <w:pPr>
+        <w:ind w:left="1080" w:hanging="360"/>
+      </w:pPr>
+      <w:rPr>
+        <w:rFonts w:hint="default"/>
+      </w:rPr>
+    </w:lvl>
+    <w:lvl w:ilvl="1" w:tplc="FFFFFFFF" w:tentative="1">
+      <w:start w:val="1"/>
+      <w:numFmt w:val="lowerLetter"/>
+      <w:lvlText w:val="%2."/>
+      <w:lvlJc w:val="left"/>
+      <w:pPr>
+        <w:ind w:left="1800" w:hanging="360"/>
+      </w:pPr>
+    </w:lvl>
+    <w:lvl w:ilvl="2" w:tplc="FFFFFFFF" w:tentative="1">
+      <w:start w:val="1"/>
+      <w:numFmt w:val="lowerRoman"/>
+      <w:lvlText w:val="%3."/>
+      <w:lvlJc w:val="right"/>
+      <w:pPr>
+        <w:ind w:left="2520" w:hanging="180"/>
+      </w:pPr>
+    </w:lvl>
+    <w:lvl w:ilvl="3" w:tplc="FFFFFFFF" w:tentative="1">
+      <w:start w:val="1"/>
+      <w:numFmt w:val="decimal"/>
+      <w:lvlText w:val="%4."/>
+      <w:lvlJc w:val="left"/>
+      <w:pPr>
+        <w:ind w:left="3240" w:hanging="360"/>
+      </w:pPr>
+    </w:lvl>
+    <w:lvl w:ilvl="4" w:tplc="FFFFFFFF" w:tentative="1">
+      <w:start w:val="1"/>
+      <w:numFmt w:val="lowerLetter"/>
+      <w:lvlText w:val="%5."/>
+      <w:lvlJc w:val="left"/>
+      <w:pPr>
+        <w:ind w:left="3960" w:hanging="360"/>
+      </w:pPr>
+    </w:lvl>
+    <w:lvl w:ilvl="5" w:tplc="FFFFFFFF" w:tentative="1">
+      <w:start w:val="1"/>
+      <w:numFmt w:val="lowerRoman"/>
+      <w:lvlText w:val="%6."/>
+      <w:lvlJc w:val="right"/>
+      <w:pPr>
+        <w:ind w:left="4680" w:hanging="180"/>
+      </w:pPr>
+    </w:lvl>
+    <w:lvl w:ilvl="6" w:tplc="FFFFFFFF" w:tentative="1">
+      <w:start w:val="1"/>
+      <w:numFmt w:val="decimal"/>
+      <w:lvlText w:val="%7."/>
+      <w:lvlJc w:val="left"/>
+      <w:pPr>
+        <w:ind w:left="5400" w:hanging="360"/>
+      </w:pPr>
+    </w:lvl>
+    <w:lvl w:ilvl="7" w:tplc="FFFFFFFF" w:tentative="1">
+      <w:start w:val="1"/>
+      <w:numFmt w:val="lowerLetter"/>
+      <w:lvlText w:val="%8."/>
+      <w:lvlJc w:val="left"/>
+      <w:pPr>
+        <w:ind w:left="6120" w:hanging="360"/>
+      </w:pPr>
+    </w:lvl>
+    <w:lvl w:ilvl="8" w:tplc="FFFFFFFF" w:tentative="1">
+      <w:start w:val="1"/>
+      <w:numFmt w:val="lowerRoman"/>
+      <w:lvlText w:val="%9."/>
+      <w:lvlJc w:val="right"/>
+      <w:pPr>
+        <w:ind w:left="6840" w:hanging="180"/>
+      </w:pPr>
+    </w:lvl>
+  </w:abstractNum>
   <w:num w:numId="1" w16cid:durableId="6951074">
     <w:abstractNumId w:val="2"/>
   </w:num>
@@ -1684,6 +2244,9 @@
   </w:num>
   <w:num w:numId="3" w16cid:durableId="1834444692">
     <w:abstractNumId w:val="1"/>
+  </w:num>
+  <w:num w:numId="4" w16cid:durableId="1637295771">
+    <w:abstractNumId w:val="3"/>
   </w:num>
 </w:numbering>
 </file>
@@ -2088,6 +2651,7 @@
   <w:style w:type="paragraph" w:default="1" w:styleId="Normal">
     <w:name w:val="Normal"/>
     <w:qFormat/>
+    <w:rsid w:val="00950385"/>
   </w:style>
   <w:style w:type="paragraph" w:styleId="Heading1">
     <w:name w:val="heading 1"/>

</xml_diff>